<commit_message>
docs: ajusta CU-01 al flujo de postulacion con cuenta pendiente
La cuenta queda pendiente en lugar del pago con Transbank, el Super Admin
acepta desde un modal, llega el correo y sigue el onboarding normal.
Se actualizan diagramas A01-A16, caso de uso, Ficha 05 y fila F07 de la Ficha 04.

Co-Authored-By: Claude Sonnet 5.5 <noreply@anthropic.com>
</commit_message>
<xml_diff>
--- a/Fase 2/Evidencias Grupales/Ficha_Avance_05_Proyecto_Capstone_GRUPO06.docx
+++ b/Fase 2/Evidencias Grupales/Ficha_Avance_05_Proyecto_Capstone_GRUPO06.docx
@@ -702,7 +702,7 @@
               <w:rPr>
                 <w:sz w:val="18"/>
               </w:rPr>
-              <w:t xml:space="preserve">A02, A03, A09, A10</w:t>
+              <w:t xml:space="preserve">A10</w:t>
             </w:r>
           </w:p>
         </w:tc>
@@ -734,7 +734,7 @@
               <w:rPr>
                 <w:sz w:val="18"/>
               </w:rPr>
-              <w:t xml:space="preserve">HurryFront /register-business; HurryBack BusinessController y BusinessValidator (BusinessValidatorUniquenessTest, ChileanRutTest). Brecha: falta la prueba punta a punta de alta de negocio a publicación en el listado; se hará en la demo.</w:t>
+              <w:t xml:space="preserve">HurryFront /dashboard/onboarding (nombre del negocio, rubro, URL y sucursal); HurryBack BusinessController y BusinessValidator (BusinessValidatorUniquenessTest, ChileanRutTest). Brecha: falta la prueba punta a punta de alta de negocio a publicación en el listado; se hará en la demo.</w:t>
             </w:r>
           </w:p>
         </w:tc>
@@ -1147,7 +1147,7 @@
               <w:rPr>
                 <w:sz w:val="18"/>
               </w:rPr>
-              <w:t xml:space="preserve">A01, A04, A05, A06, A07, A08</w:t>
+              <w:t xml:space="preserve">A01 a A09</w:t>
             </w:r>
           </w:p>
         </w:tc>
@@ -1179,7 +1179,7 @@
               <w:rPr>
                 <w:sz w:val="18"/>
               </w:rPr>
-              <w:t xml:space="preserve">No existe. Hoy el negocio se registra solo en /register-business. Es el principal incremento comprometido.</w:t>
+              <w:t xml:space="preserve">Hoy existen elegir el plan (/prices) y crear la cuenta; no existen el motivo, la cuenta pendiente, los correos ni la lista de postulaciones con su modal en el Super Admin. Es el principal incremento comprometido.</w:t>
             </w:r>
           </w:p>
         </w:tc>
@@ -1236,7 +1236,7 @@
               <w:rPr>
                 <w:sz w:val="18"/>
               </w:rPr>
-              <w:t xml:space="preserve">A09 (plan sin cobro)</w:t>
+              <w:t xml:space="preserve">A04, A09</w:t>
             </w:r>
           </w:p>
         </w:tc>
@@ -1268,7 +1268,7 @@
               <w:rPr>
                 <w:sz w:val="18"/>
               </w:rPr>
-              <w:t xml:space="preserve">No iniciada: el flujo actual pasa por el pago. Se resolverá en un proyecto aparte clonado de HurryUp (front y back).</w:t>
+              <w:t xml:space="preserve">No iniciada: el flujo actual continúa al pago con Transbank (/checkout); se reemplaza por la aprobación del Super Admin. Se resolverá en un proyecto aparte clonado de HurryUp (front y back).</w:t>
             </w:r>
           </w:p>
         </w:tc>
@@ -1897,7 +1897,7 @@
               <w:rPr>
                 <w:sz w:val="18"/>
               </w:rPr>
-              <w:t xml:space="preserve">F01, F03 y F04 (100 % en la ficha 04) corresponden a A16: reservas, listado de negocios e información pública. F02 corresponde a A02, A03, A09 y A10 (registro y onboarding actual, parcial); F05 y F06 corresponden a A16 (modal con portafolio y fotos, parcial). F07 corresponde a A01 y A04 a A08; F08, a A09 (plan sin cobro); F09, a A11 a A15, con A14 y A15 implementadas.</w:t>
+              <w:t xml:space="preserve">F01, F03 y F04 (100 % en la ficha 04) corresponden a A16: reservas, listado de negocios e información pública. F02 corresponde a A10 (onboarding normal, parcial); F05 y F06 corresponden a A16 (modal con portafolio y fotos, parcial). F07 corresponde a A01 a A09 (postulación, cuenta pendiente, correos y aprobación del Super Admin); F08, a A04 y A09 (reemplazo del pago por la aprobación); F09, a A11 a A15, con A14 y A15 implementadas.</w:t>
             </w:r>
           </w:p>
         </w:tc>
@@ -1931,7 +1931,7 @@
               <w:rPr>
                 <w:sz w:val="18"/>
               </w:rPr>
-              <w:t xml:space="preserve">D1: datos válidos (campos obligatorios, RUT chileno válido, correo con formato correcto y no repetido); si no, A03 devuelve a A01. D2: el Super Admin aprueba o rechaza la postulación; el rechazo termina en A08. D3: el Super Admin activa o no el complemento; si no, termina en A13.</w:t>
+              <w:t xml:space="preserve">D1: datos válidos (correo con formato correcto y no registrado, contraseña, plan y motivo); si no, A03 devuelve a A01. D2: el Super Admin acepta o rechaza la postulación en el modal; el rechazo termina en A08. D3: el Super Admin activa o no el complemento solicitado; si no, termina en A13.</w:t>
             </w:r>
           </w:p>
         </w:tc>
@@ -1965,7 +1965,7 @@
               <w:rPr>
                 <w:sz w:val="18"/>
               </w:rPr>
-              <w:t xml:space="preserve">Postulante: A01, A03, A11, A16 (y recibe A06). Sistema: A02, A04, A09, A10, A13, A15. Super Admin: A07, A08, A12, A14 (recibe A05). Los datos se validan en A02/D1 y los permisos se resuelven por rol en el backend (StaffPermissionServiceTest); solo el Super Admin accede a /admin/* y sus acciones quedan en auditoría (V22).</w:t>
+              <w:t xml:space="preserve">Postulante: A01, A03, A10, A11, A16 (y recibe A06). Sistema: A02, A04, A09, A13, A15. Super Admin: A07, A08, A12, A14 (recibe A05). Los datos se validan en A02/D1 y los permisos se resuelven por rol en el backend (StaffPermissionServiceTest); solo el Super Admin accede a /admin/* y sus acciones quedan en auditoría (V22).</w:t>
             </w:r>
           </w:p>
         </w:tc>
@@ -1999,7 +1999,7 @@
               <w:rPr>
                 <w:sz w:val="18"/>
               </w:rPr>
-              <w:t xml:space="preserve">Implementadas: A14 y A15. Parciales: A02, A03, A09, A10 y A16 (en A16 existen servicios, reservas y la ficha del negocio con galería, pero falta comprobarlos en la demo). Pendientes: A01, A04, A05, A06, A07, A08, A11, A12 y A13.</w:t>
+              <w:t xml:space="preserve">Implementadas: A14 y A15. Parciales: A01, A02, A03, A10 y A16 (existen elegir el plan, crear la cuenta, las validaciones, el onboarding y, en A16, servicios, reservas y la ficha del negocio con galería, pero falta comprobarlos en la demo). Pendientes: A04 a A09 y A11 a A13.</w:t>
             </w:r>
           </w:p>
         </w:tc>
@@ -2033,7 +2033,7 @@
               <w:rPr>
                 <w:sz w:val="18"/>
               </w:rPr>
-              <w:t xml:space="preserve">El diagrama modela el acceso por postulación sin cobro, que aún no existe: hoy el negocio se registra solo en /register-business y contrata un plan en /checkout. Las actividades pendientes son el incremento comprometido (F07, F08 y F09).</w:t>
+              <w:t xml:space="preserve">El diagrama modela el acceso por postulación sin cobro: la cuenta queda pendiente hasta que el Super Admin la acepta y recién entonces sigue el onboarding. Eso aún no existe: hoy el flujo continúa de la cuenta al pago con Transbank (/checkout). Las actividades pendientes son el incremento comprometido (F07, F08 y F09).</w:t>
             </w:r>
           </w:p>
         </w:tc>
@@ -2236,7 +2236,7 @@
               <w:rPr>
                 <w:sz w:val="18"/>
               </w:rPr>
-              <w:t xml:space="preserve">Precondiciones: el rubro «Peluquería canina / Grooming» existe en el catálogo (migración V33, perfil PETS) y hay una cuenta Super Admin activa. Datos de entrada: nombre del negocio, RUT, correo del dueño, teléfono, región y dirección, rubro, plan elegido, complemento deseado y motivo de la postulación.</w:t>
+              <w:t xml:space="preserve">Precondiciones: el rubro «Peluquería canina / Grooming» existe en el catálogo (migración V33, perfil PETS), hay una cuenta Super Admin activa y el correo del Super Admin está configurado. Datos de entrada: correo, contraseña, plan elegido y motivo de la postulación; luego, en el onboarding, nombre del negocio, rubro, URL y sucursal.</w:t>
             </w:r>
           </w:p>
         </w:tc>
@@ -2270,7 +2270,7 @@
               <w:rPr>
                 <w:sz w:val="18"/>
               </w:rPr>
-              <w:t xml:space="preserve">Reglas: campos obligatorios y RUT chileno válido; correo con formato válido y no repetido; la postulación nace en estado PENDIENTE y solo el Super Admin aprueba; ningún plan ni complemento se cobra, los complementos se activan como regalo y quedan en auditoría. Alternativas ante error: datos inválidos, A03 y reintento; postulación rechazada, A08; complemento no activado, A13.</w:t>
+              <w:t xml:space="preserve">Reglas: campos obligatorios (correo, contraseña, plan y motivo); correo con formato válido y no registrado; la postulación nace PENDIENTE y la cuenta no puede iniciar el onboarding hasta que el Super Admin la acepte; no hay pago con Transbank ni cobro de complementos, que se solicitan y el Super Admin activa o regala. Alternativas ante error: datos inválidos, A03 y reintento; postulación rechazada, A08; complemento no activado, A13.</w:t>
             </w:r>
           </w:p>
         </w:tc>
@@ -2304,7 +2304,7 @@
               <w:rPr>
                 <w:sz w:val="18"/>
               </w:rPr>
-              <w:t xml:space="preserve">Salida: cuenta del dueño y negocio creados (rubro Peluquería canina, plan sin cobro), complemento Inventario activo sin cobro, correos enviados y negocio visible en el Marketplace con su página de reservas. Datos registrados: postulación (estado, plan y motivo), negocio, usuario dueño, suscripción sin cobro, regalo del complemento (código inventory, nota y vencimiento) y evento de auditoría.</w:t>
+              <w:t xml:space="preserve">Salida: cuenta aceptada por el Super Admin, correo «ya puedes iniciar tu onboarding», negocio creado en el onboarding, complemento Inventario activo sin cobro y negocio visible en el Marketplace con su página de reservas. Datos registrados: postulación (correo, plan, motivo y estado), cuenta del postulante, negocio, suscripción sin cobro, regalo del complemento (código inventory, nota y vencimiento) y evento de auditoría.</w:t>
             </w:r>
           </w:p>
         </w:tc>
@@ -2422,7 +2422,7 @@
               <w:rPr>
                 <w:sz w:val="18"/>
               </w:rPr>
-              <w:t xml:space="preserve">A01</w:t>
+              <w:t xml:space="preserve">A01, A02, D1, A03</w:t>
             </w:r>
           </w:p>
         </w:tc>
@@ -2438,7 +2438,7 @@
               <w:rPr>
                 <w:sz w:val="18"/>
               </w:rPr>
-              <w:t xml:space="preserve">Pendiente (F07). El ingreso equivalente hoy es el formulario /register-business (negocio y dueño), con los mismos datos de entrada. Captura por adjuntar en Evidencias de sistema.</w:t>
+              <w:t xml:space="preserve">Parcial. Hoy existen elegir el plan en /prices y crear la cuenta, con sus validaciones y mensajes de error. Falta el campo «por qué quiere postular». Captura por adjuntar en Evidencias de sistema.</w:t>
             </w:r>
           </w:p>
         </w:tc>
@@ -2472,7 +2472,7 @@
               <w:rPr>
                 <w:sz w:val="18"/>
               </w:rPr>
-              <w:t xml:space="preserve">A02, D1, A03, A07, D2</w:t>
+              <w:t xml:space="preserve">A04, A05, A06, A07, D2</w:t>
             </w:r>
           </w:p>
         </w:tc>
@@ -2488,7 +2488,7 @@
               <w:rPr>
                 <w:sz w:val="18"/>
               </w:rPr>
-              <w:t xml:space="preserve">Parcial. La validación de datos y RUT está implementada en el registro actual (BusinessValidator; BusinessValidatorUniquenessTest, ChileanRutTest). La decisión del Super Admin (A07, D2) está pendiente porque no existe la bandeja de postulaciones.</w:t>
+              <w:t xml:space="preserve">Pendiente (F07 y F08). Hoy, después de crear la cuenta, el flujo continúa al pago con Transbank (/checkout). Aún no existen la cuenta pendiente, los correos, la lista de postulaciones ni el modal del Super Admin para aceptar o rechazar.</w:t>
             </w:r>
           </w:p>
         </w:tc>
@@ -2522,7 +2522,7 @@
               <w:rPr>
                 <w:sz w:val="18"/>
               </w:rPr>
-              <w:t xml:space="preserve">A04, A09, A10, A14</w:t>
+              <w:t xml:space="preserve">A09, A10, A14</w:t>
             </w:r>
           </w:p>
         </w:tc>
@@ -2538,7 +2538,7 @@
               <w:rPr>
                 <w:sz w:val="18"/>
               </w:rPr>
-              <w:t xml:space="preserve">Parcial. La creación de cuenta y negocio (A09) y el regalo de complemento con auditoría (A14; AddonService.grant) están implementados. El registro de la postulación (A04) y el plan sin cobro (F08) están pendientes.</w:t>
+              <w:t xml:space="preserve">Parcial. El onboarding (nombre del negocio, rubro, URL y sucursal) existe en /dashboard/onboarding (A10) y el regalo de complemento con auditoría está implementado (A14; AddonService.grant). Pendientes: la activación de la cuenta con el correo de aceptación (A09) y condicionar el onboarding a esa aprobación.</w:t>
             </w:r>
           </w:p>
         </w:tc>
@@ -2638,7 +2638,7 @@
               <w:rPr>
                 <w:sz w:val="18"/>
               </w:rPr>
-              <w:t xml:space="preserve">Parcial. A03 (mensajes de validación del formulario actual) está implementada; A08 y A13 (rechazo y aviso de no activación) están pendientes. El flujo completo se interrumpe en A01 porque la postulación aún no existe.</w:t>
+              <w:t xml:space="preserve">Parcial. A03 (mensajes de validación del formulario actual) está implementada; A08 y A13 (rechazo y aviso de no activación) están pendientes. El flujo completo se interrumpe en A04, porque la aprobación del Super Admin aún no existe.</w:t>
             </w:r>
           </w:p>
         </w:tc>
@@ -2751,7 +2751,7 @@
               <w:rPr>
                 <w:sz w:val="18"/>
               </w:rPr>
-              <w:t xml:space="preserve">F08: no hay modo sin cobro (A09).</w:t>
+              <w:t xml:space="preserve">F08 y F07 (A01 a A06): no hay postulación; el flujo termina en el pago con Transbank.</w:t>
             </w:r>
           </w:p>
         </w:tc>
@@ -2767,7 +2767,7 @@
               <w:rPr>
                 <w:sz w:val="18"/>
               </w:rPr>
-              <w:t xml:space="preserve">Proyecto aparte clonado de HurryUp (front y back) con Transbank desactivado y sin cobro de planes ni complementos.</w:t>
+              <w:t xml:space="preserve">Proyecto aparte clonado de HurryUp (front y back) con Transbank desactivado: elegir plan, crear la cuenta con el motivo y mostrar «postulación enviada»; correos de aviso al Super Admin y de acuse.</w:t>
             </w:r>
           </w:p>
         </w:tc>
@@ -2799,7 +2799,7 @@
               <w:rPr>
                 <w:sz w:val="18"/>
               </w:rPr>
-              <w:t xml:space="preserve">Se crea un negocio sin pasar por el pago y los complementos no se cobran.</w:t>
+              <w:t xml:space="preserve">Una postulación válida deja la cuenta pendiente, muestra «postulación enviada» y llegan los dos correos; un dato inválido muestra el error.</w:t>
             </w:r>
           </w:p>
         </w:tc>
@@ -2817,7 +2817,7 @@
               <w:rPr>
                 <w:sz w:val="18"/>
               </w:rPr>
-              <w:t xml:space="preserve">F07: no existe la postulación (A01 a A08).</w:t>
+              <w:t xml:space="preserve">F07 (A07 a A09): el Super Admin no puede revisar postulaciones.</w:t>
             </w:r>
           </w:p>
         </w:tc>
@@ -2833,7 +2833,7 @@
               <w:rPr>
                 <w:sz w:val="18"/>
               </w:rPr>
-              <w:t xml:space="preserve">Formulario de postulación con el plan elegido; la postulación llega al Super Admin y a su correo, y se ve en una bandeja.</w:t>
+              <w:t xml:space="preserve">Lista de postulaciones en el panel del Super Admin con modal para aceptar o rechazar, y correo «ya puedes iniciar tu onboarding».</w:t>
             </w:r>
           </w:p>
         </w:tc>
@@ -2865,7 +2865,7 @@
               <w:rPr>
                 <w:sz w:val="18"/>
               </w:rPr>
-              <w:t xml:space="preserve">Una postulación válida queda PENDIENTE, aparece en la bandeja y llega el correo; un dato inválido muestra el error. Al aprobar se crea el negocio.</w:t>
+              <w:t xml:space="preserve">Al aceptar, la cuenta se activa, llega el correo y el postulante continúa el onboarding normal hasta el dashboard.</w:t>
             </w:r>
           </w:p>
         </w:tc>
@@ -3247,7 +3247,7 @@
               <w:rPr>
                 <w:sz w:val="18"/>
               </w:rPr>
-              <w:t xml:space="preserve">El modelo comercial actual supone pago con Transbank y cobro de complementos; adaptarlo a postulación sin cobro toca el registro y el panel, con riesgo de regresión. Además, el alta de negocio, el modal y las fotos están implementados pero sin comprobar en demo ni con pruebas automatizadas, por lo que se mantienen en 50 %.</w:t>
+              <w:t xml:space="preserve">El modelo comercial actual supone pago con Transbank y cobro de complementos; reemplazar el pago por la aprobación del Super Admin toca el flujo de cuenta, el checkout y el panel, con riesgo de regresión. Además, el alta de negocio, el modal y las fotos están implementados pero sin comprobar en demo ni con pruebas automatizadas, por lo que se mantienen en 50 %.</w:t>
             </w:r>
           </w:p>
         </w:tc>
@@ -3316,7 +3316,7 @@
       </w:r>
       <w:r>
         <w:rPr/>
-        <w:t xml:space="preserve">Al dibujar el flujo A01–A16 vimos que el sistema ya cubre el registro, el Marketplace y el regalo de complementos por el Super Admin, pero la postulación y la solicitud de complementos aún no existen: hoy el negocio se registra y paga. Cambiaremos la planificación para priorizar F07, F08 y F09, marcar cada actividad con su estado y no declarar terminada una función sin demostrarla.</w:t>
+        <w:t xml:space="preserve">Al dibujar el flujo A01–A16 vimos que el sistema ya cubre el registro, el Marketplace y el regalo de complementos por el Super Admin, pero la postulación, la aprobación del Super Admin y la solicitud de complementos aún no existen: hoy el negocio crea su cuenta y paga con Transbank. Cambiaremos la planificación para priorizar F07, F08 y F09, marcar cada actividad con su estado y no declarar terminada una función sin demostrarla.</w:t>
       </w:r>
     </w:p>
     <w:p>

</xml_diff>